<commit_message>
Implementación La Bancaria: resumen de 6 páginas del catálogo de trámites, y los dos Word (resumen y completo) en Recursos de /entornos
Co-authored-by: Claude <noreply@anthropic.com>
Co-Authored-By: Claude Opus 5.5 <noreply@anthropic.com>
Claude-Session: https://claude.ai/code/session_01V4eqy2aMXz4L4fJbjaqoPy
</commit_message>
<xml_diff>
--- a/docs/bancaria/tramites-bancaria.docx
+++ b/docs/bancaria/tramites-bancaria.docx
@@ -26150,8 +26150,8 @@
       <w:b/>
       <w:bCs/>
       <w:color w:val="0A1421"/>
-      <w:sz w:val="52"/>
-      <w:szCs w:val="52"/>
+      <w:sz w:val="48"/>
+      <w:szCs w:val="48"/>
     </w:rPr>
   </w:style>
   <w:style w:type="paragraph" w:styleId="Heading1">
@@ -26189,8 +26189,8 @@
       <w:b/>
       <w:bCs/>
       <w:color w:val="0A1421"/>
-      <w:sz w:val="29"/>
-      <w:szCs w:val="29"/>
+      <w:sz w:val="28"/>
+      <w:szCs w:val="28"/>
     </w:rPr>
   </w:style>
   <w:style w:type="paragraph" w:styleId="Heading3">

</xml_diff>